<commit_message>
nev petition-for-writ gated: footnote.widows keeps a list item that calls a note whole in every engine; the docx authorities list footnote pages on the model at 09043fb05; tier 1 0 failed and XENG-001..003 pass on typst, latex and docx; cross_engine: gate (fb-595.54.18)
Co-Authored-By: Claude Opus 5.5 <noreply@anthropic.com>
</commit_message>
<xml_diff>
--- a/courts/ninth-circuit/nevada/state/supreme-court/petition-for-writ/usage/OUTPUT-petition-for-writ.docx
+++ b/courts/ninth-circuit/nevada/state/supreme-court/petition-for-writ/usage/OUTPUT-petition-for-writ.docx
@@ -2584,7 +2584,7 @@
         <w:tab/>
       </w:r>
       <w:r>
-        <w:t xml:space="preserve">12</w:t>
+        <w:t xml:space="preserve">13</w:t>
       </w:r>
     </w:p>
     <w:p>
@@ -2792,7 +2792,7 @@
         <w:tab/>
       </w:r>
       <w:r>
-        <w:t xml:space="preserve">16</w:t>
+        <w:t xml:space="preserve">17</w:t>
       </w:r>
     </w:p>
     <w:p>
@@ -3442,7 +3442,7 @@
           <w:tab w:val="right" w:leader="dot" w:pos="9360"/>
         </w:tabs>
         <w:spacing w:before="252" w:after="0" w:line="322" w:lineRule="exact"/>
-        <w:ind w:left="420" w:right="1680" w:hanging="420"/>
+        <w:ind w:left="420" w:right="1260" w:hanging="420"/>
       </w:pPr>
       <w:r>
         <w:t xml:space="preserve">Nev.</w:t>
@@ -3484,7 +3484,7 @@
         <w:tab/>
       </w:r>
       <w:r>
-        <w:t xml:space="preserve">1, 3, 16, 17, 24</w:t>
+        <w:t xml:space="preserve">1, 3, 17, 24</w:t>
       </w:r>
     </w:p>
     <w:p>
@@ -3681,7 +3681,7 @@
         <w:tab/>
       </w:r>
       <w:r>
-        <w:t xml:space="preserve">11</w:t>
+        <w:t xml:space="preserve">12</w:t>
       </w:r>
     </w:p>
     <w:p>
@@ -3822,7 +3822,7 @@
         <w:tab/>
       </w:r>
       <w:r>
-        <w:t xml:space="preserve">22</w:t>
+        <w:t xml:space="preserve">23</w:t>
       </w:r>
     </w:p>
     <w:p>
@@ -4090,7 +4090,7 @@
         <w:tab/>
       </w:r>
       <w:r>
-        <w:t xml:space="preserve">20</w:t>
+        <w:t xml:space="preserve">21</w:t>
       </w:r>
     </w:p>
     <w:p>
@@ -4231,7 +4231,7 @@
         <w:tab/>
       </w:r>
       <w:r>
-        <w:t xml:space="preserve">22</w:t>
+        <w:t xml:space="preserve">23</w:t>
       </w:r>
     </w:p>
     <w:p>
@@ -4569,7 +4569,7 @@
         <w:tab/>
       </w:r>
       <w:r>
-        <w:t xml:space="preserve">20</w:t>
+        <w:t xml:space="preserve">21</w:t>
       </w:r>
     </w:p>
     <w:p>
@@ -5878,7 +5878,91 @@
         <w:tab/>
       </w:r>
       <w:r>
-        <w:t xml:space="preserve">13, 14</w:t>
+        <w:t xml:space="preserve">14</w:t>
+      </w:r>
+    </w:p>
+    <w:p>
+      <w:pPr>
+        <w:keepLines/>
+        <w:tabs>
+          <w:tab w:val="right" w:leader="dot" w:pos="9360"/>
+        </w:tabs>
+        <w:spacing w:before="252" w:after="0" w:line="322" w:lineRule="exact"/>
+        <w:ind w:left="420" w:right="1400" w:hanging="420"/>
+      </w:pPr>
+      <w:r>
+        <w:t xml:space="preserve">NRS</w:t>
+      </w:r>
+      <w:r>
+        <w:t xml:space="preserve"> </w:t>
+      </w:r>
+      <w:r>
+        <w:t xml:space="preserve">293.269935</w:t>
+      </w:r>
+      <w:r>
+        <w:t xml:space="preserve">   </w:t>
+      </w:r>
+      <w:r>
+        <w:tab/>
+      </w:r>
+      <w:r>
+        <w:t xml:space="preserve">3, 13, 16, 24</w:t>
+      </w:r>
+    </w:p>
+    <w:p>
+      <w:pPr>
+        <w:keepLines/>
+        <w:tabs>
+          <w:tab w:val="right" w:leader="dot" w:pos="9360"/>
+        </w:tabs>
+        <w:spacing w:before="252" w:after="0" w:line="322" w:lineRule="exact"/>
+        <w:ind w:left="420" w:right="1680" w:hanging="420"/>
+      </w:pPr>
+      <w:r>
+        <w:t xml:space="preserve">NRS</w:t>
+      </w:r>
+      <w:r>
+        <w:t xml:space="preserve"> </w:t>
+      </w:r>
+      <w:r>
+        <w:t xml:space="preserve">293.277</w:t>
+      </w:r>
+      <w:r>
+        <w:t xml:space="preserve">   </w:t>
+      </w:r>
+      <w:r>
+        <w:tab/>
+      </w:r>
+      <w:r>
+        <w:t xml:space="preserve">1, 3, 18, 20, 24</w:t>
+      </w:r>
+    </w:p>
+    <w:p>
+      <w:pPr>
+        <w:keepLines/>
+        <w:tabs>
+          <w:tab w:val="right" w:leader="dot" w:pos="9360"/>
+        </w:tabs>
+        <w:spacing w:before="252" w:after="0" w:line="322" w:lineRule="exact"/>
+        <w:ind w:left="420" w:right="2100" w:hanging="420"/>
+      </w:pPr>
+      <w:r>
+        <w:t xml:space="preserve">NRS</w:t>
+      </w:r>
+      <w:r>
+        <w:t xml:space="preserve"> </w:t>
+      </w:r>
+      <w:r>
+        <w:t xml:space="preserve">293.285</w:t>
+      </w:r>
+      <w:r>
+        <w:t xml:space="preserve">   </w:t>
+      </w:r>
+      <w:r>
+        <w:tab/>
+      </w:r>
+      <w:r>
+        <w:t xml:space="preserve">1, 3, 18, 19, 20, 24</w:t>
       </w:r>
     </w:p>
     <w:p>
@@ -5897,7 +5981,7 @@
         <w:t xml:space="preserve"> </w:t>
       </w:r>
       <w:r>
-        <w:t xml:space="preserve">293.269935</w:t>
+        <w:t xml:space="preserve">293.3606</w:t>
       </w:r>
       <w:r>
         <w:t xml:space="preserve">   </w:t>
@@ -5906,91 +5990,7 @@
         <w:tab/>
       </w:r>
       <w:r>
-        <w:t xml:space="preserve">3, 12, 13, 16, 24</w:t>
-      </w:r>
-    </w:p>
-    <w:p>
-      <w:pPr>
-        <w:keepLines/>
-        <w:tabs>
-          <w:tab w:val="right" w:leader="dot" w:pos="9360"/>
-        </w:tabs>
-        <w:spacing w:before="252" w:after="0" w:line="322" w:lineRule="exact"/>
-        <w:ind w:left="420" w:right="1680" w:hanging="420"/>
-      </w:pPr>
-      <w:r>
-        <w:t xml:space="preserve">NRS</w:t>
-      </w:r>
-      <w:r>
-        <w:t xml:space="preserve"> </w:t>
-      </w:r>
-      <w:r>
-        <w:t xml:space="preserve">293.277</w:t>
-      </w:r>
-      <w:r>
-        <w:t xml:space="preserve">   </w:t>
-      </w:r>
-      <w:r>
-        <w:tab/>
-      </w:r>
-      <w:r>
-        <w:t xml:space="preserve">1, 3, 18, 20, 24</w:t>
-      </w:r>
-    </w:p>
-    <w:p>
-      <w:pPr>
-        <w:keepLines/>
-        <w:tabs>
-          <w:tab w:val="right" w:leader="dot" w:pos="9360"/>
-        </w:tabs>
-        <w:spacing w:before="252" w:after="0" w:line="322" w:lineRule="exact"/>
-        <w:ind w:left="420" w:right="2100" w:hanging="420"/>
-      </w:pPr>
-      <w:r>
-        <w:t xml:space="preserve">NRS</w:t>
-      </w:r>
-      <w:r>
-        <w:t xml:space="preserve"> </w:t>
-      </w:r>
-      <w:r>
-        <w:t xml:space="preserve">293.285</w:t>
-      </w:r>
-      <w:r>
-        <w:t xml:space="preserve">   </w:t>
-      </w:r>
-      <w:r>
-        <w:tab/>
-      </w:r>
-      <w:r>
-        <w:t xml:space="preserve">1, 3, 18, 19, 20, 24</w:t>
-      </w:r>
-    </w:p>
-    <w:p>
-      <w:pPr>
-        <w:keepLines/>
-        <w:tabs>
-          <w:tab w:val="right" w:leader="dot" w:pos="9360"/>
-        </w:tabs>
-        <w:spacing w:before="252" w:after="0" w:line="322" w:lineRule="exact"/>
-        <w:ind w:left="420" w:right="2240" w:hanging="420"/>
-      </w:pPr>
-      <w:r>
-        <w:t xml:space="preserve">NRS</w:t>
-      </w:r>
-      <w:r>
-        <w:t xml:space="preserve"> </w:t>
-      </w:r>
-      <w:r>
-        <w:t xml:space="preserve">293.3606</w:t>
-      </w:r>
-      <w:r>
-        <w:t xml:space="preserve">   </w:t>
-      </w:r>
-      <w:r>
-        <w:tab/>
-      </w:r>
-      <w:r>
-        <w:t xml:space="preserve">3, 12, 13, 14, 16, 24</w:t>
+        <w:t xml:space="preserve">3, 13, 14, 16, 24</w:t>
       </w:r>
     </w:p>
     <w:p>
@@ -6502,7 +6502,7 @@
     </w:p>
     <w:p>
       <w:pPr>
-        <w:pStyle w:val="BodyTextNote"/>
+        <w:pStyle w:val="BodyText"/>
       </w:pPr>
       <w:r>
         <w:t xml:space="preserve">A writ of mandamus may be issued by the court “to compel the performance of an act which the law especially enjoins as a duty resulting from an office, trust or station; or to compel the admission of a party to the use and enjoyment of a right or office to which the party is entitled and from which the party is unlawfully precluded by such inferior tribunal, corporation, board or person,” when there is no plain, speedy, and adequate remedy in the ordinary course.</w:t>
@@ -6734,7 +6734,7 @@
     </w:p>
     <w:p>
       <w:pPr>
-        <w:pStyle w:val="BodyTextNote"/>
+        <w:pStyle w:val="BodyText"/>
       </w:pPr>
       <w:r>
         <w:t xml:space="preserve">On September 6, 2022, the Nye County Clerk’s office officially announced its intention to use paper ballots and hand counting procedures for all ballots during the 2022 General Election.</w:t>
@@ -6772,7 +6772,7 @@
     </w:p>
     <w:p>
       <w:pPr>
-        <w:pStyle w:val="BodyTextNote"/>
+        <w:pStyle w:val="BodyText"/>
       </w:pPr>
       <w:r>
         <w:t xml:space="preserve">In addition to this official announcement, interim Nye County Clerk Mark Kampf presented to the Nye County Board of Commissioners on September 20, 2022, “Presentation regarding the paper ballot and hand-count process to be implemented for the Nye County General Election in November 2022.”</w:t>
@@ -6938,7 +6938,7 @@
     </w:p>
     <w:p>
       <w:pPr>
-        <w:pStyle w:val="BodyTextNote"/>
+        <w:pStyle w:val="BodyText"/>
       </w:pPr>
       <w:r>
         <w:t xml:space="preserve">During this presentation, Kampf provided additional details on the hand count process Nye County plans to use during the 2022 General Election, and explicitly stated that the process is “very locked in” with no changes to be made.</w:t>
@@ -7032,7 +7032,7 @@
     </w:p>
     <w:p>
       <w:pPr>
-        <w:pStyle w:val="BodyTextNote"/>
+        <w:pStyle w:val="BodyText"/>
       </w:pPr>
       <w:r>
         <w:t xml:space="preserve">On October 4, 2022, Petitioners first attempted to address these issues by filing an Emergency Petition for Writ of Mandamus Enjoining Nye County Interim Clerk from Implementing Proposed Unlawful Hand Counting Measures During the November 2022 General Election and Complaint for Declaratory and Injunctive Relief in the Fifth Judicial District Court.</w:t>
@@ -7106,7 +7106,7 @@
     </w:p>
     <w:p>
       <w:pPr>
-        <w:pStyle w:val="BodyTextNote"/>
+        <w:pStyle w:val="BodyText"/>
       </w:pPr>
       <w:r>
         <w:t xml:space="preserve">Due to the two attempts at service and the urgency of the writ of mandamus, counsel for Petitioners reached out to Mr. Carbone and Mr. Sutton via email on October 5, 2022 to inquire about their availability to accept service of process.</w:t>
@@ -7156,7 +7156,7 @@
     </w:p>
     <w:p>
       <w:pPr>
-        <w:pStyle w:val="BodyTextNote"/>
+        <w:pStyle w:val="BodyText"/>
       </w:pPr>
       <w:r>
         <w:t xml:space="preserve">A final order denying the Petitioners’/​Plaintiffs’ Emergency Petition for Writ of Mandamus and Complaint for Declaratory and Injunctive Relief was issued on October 12, 2022.</w:t>
@@ -7356,7 +7356,7 @@
     </w:p>
     <w:p>
       <w:pPr>
-        <w:pStyle w:val="BodyTextNote"/>
+        <w:pStyle w:val="BodyText"/>
       </w:pPr>
       <w:r>
         <w:t xml:space="preserve">Writ relief is an extraordinary remedy, and therefore, it is within the court’s sound discretion whether to grant such relief.</w:t>
@@ -7370,7 +7370,7 @@
     </w:p>
     <w:p>
       <w:pPr>
-        <w:pStyle w:val="BodyTextNote"/>
+        <w:pStyle w:val="BodyText"/>
       </w:pPr>
       <w:r>
         <w:t xml:space="preserve">“Extraordinary writ relief may be available where there is no ‘plain, speedy and adequate remedy in the ordinary course of law.’”</w:t>
@@ -7417,7 +7417,7 @@
     </w:p>
     <w:p>
       <w:pPr>
-        <w:pStyle w:val="BodyTextNote"/>
+        <w:pStyle w:val="BodyText"/>
       </w:pPr>
       <w:r>
         <w:t xml:space="preserve">considering the petition.</w:t>
@@ -7431,7 +7431,7 @@
     </w:p>
     <w:p>
       <w:pPr>
-        <w:pStyle w:val="BodyTextNote"/>
+        <w:pStyle w:val="BodyText"/>
       </w:pPr>
       <w:r>
         <w:t xml:space="preserve">A writ of mandamus may be issued by the court “to compel the performance of an act which the law especially enjoins as a duty resulting from an office, trust or station; or to compel the admission of a party to the use and enjoyment of a right or office to which the party is entitled and from which the party is unlawfully precluded by such inferior tribunal, corporation, board or person,” when there is no plain, speedy, and adequate remedy in the ordinary course.</w:t>
@@ -7829,7 +7829,7 @@
     </w:p>
     <w:p>
       <w:pPr>
-        <w:pStyle w:val="BodyTextNote"/>
+        <w:pStyle w:val="BodyText"/>
       </w:pPr>
       <w:r>
         <w:t xml:space="preserve">NRS 293.269935</w:t>
@@ -7855,7 +7855,7 @@
     </w:p>
     <w:p>
       <w:pPr>
-        <w:pStyle w:val="BodyTextNote"/>
+        <w:pStyle w:val="BodyText"/>
       </w:pPr>
       <w:r>
         <w:t xml:space="preserve">When counting ballots, the process must be conducted in public, open to observation.</w:t>
@@ -7915,7 +7915,7 @@
     </w:p>
     <w:p>
       <w:pPr>
-        <w:pStyle w:val="BodyTextNote"/>
+        <w:pStyle w:val="BodyText"/>
       </w:pPr>
       <w:r>
         <w:t xml:space="preserve">However, Nevada law is clear that the returns of these counts, for both mail-in ballots and early voting returns, must not be reported until the polls have closed on election day.</w:t>
@@ -7929,7 +7929,7 @@
     </w:p>
     <w:p>
       <w:pPr>
-        <w:pStyle w:val="BodyTextNote"/>
+        <w:pStyle w:val="BodyText"/>
       </w:pPr>
       <w:r>
         <w:t xml:space="preserve">The current process, followed throughout the state and the country, uses mechanical voting systems, and its processing of ballots prior to the closing of polls on election day complies with both the public counting aspect of the law and not releasing any information pertaining to the count prior to the close of polls on election day. Compliance with both of these laws can be achieved simultaneously because mechanical tabulators are programmed not to produce sums until election night, and the results of the election are not printed until the closing of polls on election day.</w:t>
@@ -7961,7 +7961,7 @@
     </w:p>
     <w:p>
       <w:pPr>
-        <w:pStyle w:val="BodyTextNote"/>
+        <w:pStyle w:val="BodyText"/>
       </w:pPr>
       <w:r>
         <w:t xml:space="preserve">Mr. Kampf’s current process for hand counting will be public, as required by Nevada state law.</w:t>
@@ -8019,7 +8019,7 @@
     </w:p>
     <w:p>
       <w:pPr>
-        <w:pStyle w:val="BodyTextNote"/>
+        <w:pStyle w:val="BodyText"/>
       </w:pPr>
       <w:r>
         <w:t xml:space="preserve">Mr. Kampf has acknowledged these violations, as it pertains to streaming the hand count live on camera, on the record at the Nye County Board of Commissioners meeting, but nonetheless determined that it is not an issue because it would be a “monumental task for anyone to be able to figure that out.”</w:t>
@@ -8483,7 +8483,7 @@
     </w:p>
     <w:p>
       <w:pPr>
-        <w:pStyle w:val="BodyTextNote"/>
+        <w:pStyle w:val="BodyText"/>
       </w:pPr>
       <w:r>
         <w:t xml:space="preserve">Mr. Kampf’s procedures for accessibility by elderly and disabled voters include one “ADA touch screen” at each polling location, satisfying HAVA’s requirements in that manner. However, Mr. Kampf has either failed to take a deeper dive into the requirements of HAVA or has chosen to ignore them, as the plan to limit access to ADA touch screen to “those with special needs” violates HAVA’s mandate that all voting systems be accessible to individuals with disabilities “in a manner that provides the same opportunity for access and participation (including privacy and independence) as for other voters.”</w:t>
@@ -8763,7 +8763,7 @@
     </w:p>
     <w:p>
       <w:pPr>
-        <w:pStyle w:val="BodyTextNote"/>
+        <w:pStyle w:val="BodyText"/>
       </w:pPr>
       <w:r>
         <w:t xml:space="preserve">Pursuant to NRS 293.8874,</w:t>
@@ -8875,7 +8875,7 @@
     </w:p>
     <w:p>
       <w:pPr>
-        <w:pStyle w:val="BodyTextNote"/>
+        <w:pStyle w:val="BodyText"/>
       </w:pPr>
       <w:r>
         <w:t xml:space="preserve">If a voter elects to prove their identity by showing identification, any of the following are acceptable: 1) a driver’s license; 2) an identification card issued by the Department of Motor Vehicles; 3) a military identification card; or 4) any other form of identification issued by a governmental agency which contains the voter’s signature and physical description or picture.</w:t>
@@ -9179,7 +9179,7 @@
     </w:p>
     <w:p>
       <w:pPr>
-        <w:pStyle w:val="BodyTextNote"/>
+        <w:pStyle w:val="BodyText"/>
       </w:pPr>
       <w:r>
         <w:t xml:space="preserve">Whether an appeal is sufficiently adequate and speedy necessarily turns on the underlying proceedings’ status, the types of issues raised in the writ petition, and whether a future appeal will permit this court to meaningfully review the issues presented.</w:t>
@@ -9193,7 +9193,7 @@
     </w:p>
     <w:p>
       <w:pPr>
-        <w:pStyle w:val="BodyTextNote"/>
+        <w:pStyle w:val="BodyText"/>
       </w:pPr>
       <w:r>
         <w:t xml:space="preserve">This court has observed that, in entertaining an original proceeding in mandamus, it has the “power to protect the rights, interests, and franchises of the state, and the rights and interests of the whole people, to enforce the performance of high officials affecting the public at large[.]”</w:t>
@@ -9285,7 +9285,7 @@
     </w:p>
     <w:p>
       <w:pPr>
-        <w:pStyle w:val="BodyTextNote"/>
+        <w:pStyle w:val="BodyText"/>
       </w:pPr>
       <w:r>
         <w:t xml:space="preserve">Voting begins on October 22, 2022, and Mr. Kampf will begin counting ballots using unlawful hand counting measures on October 25, 2022. No remedy for the issues underlined herein could be provided after election day on November 8, 2022. The election at issue in</w:t>
@@ -9675,7 +9675,7 @@
     </w:p>
     <w:p>
       <w:pPr>
-        <w:pStyle w:val="BodyTextNote"/>
+        <w:pStyle w:val="BodyText"/>
       </w:pPr>
       <w:r>
         <w:t xml:space="preserve">Even if an appeal constituted a plain, speedy, and adequate remedy at law in this matter, a petition for extraordinary relief would be justified because this petition raises “an important issue of law [that] needs clarification and public policy is served by this court’s invocation of its original jurisdiction.”</w:t>

</xml_diff>